<commit_message>
Remove suggested-reviewers placeholder from cover letter
</commit_message>
<xml_diff>
--- a/manuscript/Senapati_Cover_Letter_BMC_Medical_Informatics_and_Decision_Making.docx
+++ b/manuscript/Senapati_Cover_Letter_BMC_Medical_Informatics_and_Decision_Making.docx
@@ -203,20 +203,6 @@
           <w:sz w:val="24"/>
         </w:rPr>
         <w:t>The manuscript is original, is not under consideration elsewhere, and has no overlapping submissions. It involved no human participants, no animal subjects, no patient data and no identifiable personal information, so institutional review board approval was not applicable. Code and all episode-level outputs are archived under an MIT licence at https://doi.org/10.5281/zenodo.22851264, and the preregistration is included as supplementary material. I am the sole author and accept responsibility for the integrity of the work. I declare no competing interests beyond my employment at DaVita Inc., which had no role in the design, conduct, analysis or reporting of this study, provided no data, systems, or funding, and whose publication clearance process was determined not to apply to this independent, non-company work.</w:t>
-      </w:r>
-    </w:p>
-    <w:p>
-      <w:pPr>
-        <w:spacing w:before="0" w:after="200" w:line="360" w:lineRule="exact"/>
-      </w:pPr>
-      <w:r>
-        <w:rPr>
-          <w:rFonts w:ascii="Times New Roman" w:hAnsi="Times New Roman"/>
-          <w:b w:val="0"/>
-          <w:i w:val="0"/>
-          <w:sz w:val="24"/>
-        </w:rPr>
-        <w:t>Suggested reviewers with relevant expertise in agent evaluation and human–AI safety, none of whom I have collaborated with: PENDING — name, affiliation, email × 3.</w:t>
       </w:r>
     </w:p>
     <w:p>

</xml_diff>